<commit_message>
docs(informes): add RF/RNF mapping and repo evidence to remaining sprints
Completes the same RF-XXX/RNF-XXX requirement mapping and verified
code-evidence extracts already applied to the other sprint plans, for
Sprint 0, 3, 4, 8, 9, 10 and 11.

Co-Authored-By: Claude Sonnet 5 <noreply@anthropic.com>
</commit_message>
<xml_diff>
--- a/Documentation/informes/Plan_Iteracion_Sprint0_RespiCare.docx
+++ b/Documentation/informes/Plan_Iteracion_Sprint0_RespiCare.docx
@@ -711,6 +711,112 @@
           <w:sz w:val="24"/>
         </w:rPr>
         <w:t>Entregables de otras iteraciones (Sprint - y anteriores ya cerrados; Sprint 1 y posteriores aún no iniciados).</w:t>
+      </w:r>
+    </w:p>
+    <w:p>
+      <w:pPr>
+        <w:jc w:val="both"/>
+      </w:pPr>
+      <w:r>
+        <w:rPr>
+          <w:rFonts w:ascii="Times New Roman" w:hAnsi="Times New Roman" w:cs="Times New Roman"/>
+          <w:b/>
+          <w:i w:val="0"/>
+          <w:sz w:val="24"/>
+        </w:rPr>
+        <w:t>Requerimientos Funcionales relacionados</w:t>
+      </w:r>
+      <w:r>
+        <w:rPr>
+          <w:rFonts w:ascii="Times New Roman" w:hAnsi="Times New Roman" w:cs="Times New Roman"/>
+          <w:b w:val="0"/>
+          <w:i w:val="0"/>
+          <w:sz w:val="24"/>
+        </w:rPr>
+        <w:t xml:space="preserve"> (Documentation/trazabilidad/Matriz_Trazabilidad_RespiCare.xlsx):</w:t>
+      </w:r>
+    </w:p>
+    <w:p>
+      <w:pPr>
+        <w:pStyle w:val="ListBullet"/>
+      </w:pPr>
+      <w:r>
+        <w:rPr>
+          <w:rFonts w:ascii="Times New Roman" w:hAnsi="Times New Roman" w:cs="Times New Roman"/>
+          <w:b w:val="0"/>
+          <w:i w:val="0"/>
+          <w:sz w:val="24"/>
+        </w:rPr>
+        <w:t>Sprint de infraestructura: no introduce Requerimientos Funcionales nuevos (RF); establece la base técnica sobre la que se implementan los RF de las siguientes iteraciones.</w:t>
+      </w:r>
+    </w:p>
+    <w:p>
+      <w:pPr>
+        <w:jc w:val="both"/>
+      </w:pPr>
+      <w:r>
+        <w:rPr>
+          <w:rFonts w:ascii="Times New Roman" w:hAnsi="Times New Roman" w:cs="Times New Roman"/>
+          <w:b/>
+          <w:i w:val="0"/>
+          <w:sz w:val="24"/>
+        </w:rPr>
+        <w:t>Requerimientos No Funcionales relacionados</w:t>
+      </w:r>
+      <w:r>
+        <w:rPr>
+          <w:rFonts w:ascii="Times New Roman" w:hAnsi="Times New Roman" w:cs="Times New Roman"/>
+          <w:b w:val="0"/>
+          <w:i w:val="0"/>
+          <w:sz w:val="24"/>
+        </w:rPr>
+        <w:t xml:space="preserve"> (FD03-EPIS-Informe SRS de Proyecto.docx, Cuadro de Requerimientos No Funcionales):</w:t>
+      </w:r>
+    </w:p>
+    <w:p>
+      <w:pPr>
+        <w:pStyle w:val="ListBullet"/>
+      </w:pPr>
+      <w:r>
+        <w:rPr>
+          <w:rFonts w:ascii="Times New Roman" w:hAnsi="Times New Roman" w:cs="Times New Roman"/>
+          <w:b/>
+          <w:i w:val="0"/>
+          <w:sz w:val="24"/>
+        </w:rPr>
+        <w:t>RNF-006</w:t>
+      </w:r>
+      <w:r>
+        <w:rPr>
+          <w:rFonts w:ascii="Times New Roman" w:hAnsi="Times New Roman" w:cs="Times New Roman"/>
+          <w:b w:val="0"/>
+          <w:i w:val="0"/>
+          <w:sz w:val="24"/>
+        </w:rPr>
+        <w:t>: Compatibilidad</w:t>
+      </w:r>
+    </w:p>
+    <w:p>
+      <w:pPr>
+        <w:pStyle w:val="ListBullet"/>
+      </w:pPr>
+      <w:r>
+        <w:rPr>
+          <w:rFonts w:ascii="Times New Roman" w:hAnsi="Times New Roman" w:cs="Times New Roman"/>
+          <w:b/>
+          <w:i w:val="0"/>
+          <w:sz w:val="24"/>
+        </w:rPr>
+        <w:t>RNF-009</w:t>
+      </w:r>
+      <w:r>
+        <w:rPr>
+          <w:rFonts w:ascii="Times New Roman" w:hAnsi="Times New Roman" w:cs="Times New Roman"/>
+          <w:b w:val="0"/>
+          <w:i w:val="0"/>
+          <w:sz w:val="24"/>
+        </w:rPr>
+        <w:t>: Mantenibilidad</w:t>
       </w:r>
     </w:p>
     <w:p>
@@ -3437,6 +3543,544 @@
     <w:p/>
     <w:p>
       <w:pPr>
+        <w:jc w:val="both"/>
+      </w:pPr>
+      <w:r>
+        <w:rPr>
+          <w:rFonts w:ascii="Times New Roman" w:hAnsi="Times New Roman" w:cs="Times New Roman"/>
+          <w:b/>
+          <w:i w:val="0"/>
+          <w:sz w:val="24"/>
+        </w:rPr>
+        <w:t>Evidencia de código (extractos reales verificados del repositorio):</w:t>
+      </w:r>
+    </w:p>
+    <w:p>
+      <w:pPr>
+        <w:jc w:val="both"/>
+      </w:pPr>
+      <w:r>
+        <w:rPr>
+          <w:rFonts w:ascii="Times New Roman" w:hAnsi="Times New Roman" w:cs="Times New Roman"/>
+          <w:b w:val="0"/>
+          <w:i/>
+          <w:sz w:val="24"/>
+        </w:rPr>
+        <w:t>Entregable: Configuración de Docker y Docker Compose</w:t>
+      </w:r>
+    </w:p>
+    <w:p>
+      <w:pPr>
+        <w:jc w:val="both"/>
+      </w:pPr>
+      <w:r>
+        <w:rPr>
+          <w:rFonts w:ascii="Consolas" w:hAnsi="Consolas" w:cs="Consolas"/>
+          <w:b w:val="0"/>
+          <w:i w:val="0"/>
+          <w:sz w:val="18"/>
+        </w:rPr>
+        <w:t>docker-compose.yml</w:t>
+      </w:r>
+      <w:r>
+        <w:rPr>
+          <w:rFonts w:ascii="Times New Roman" w:hAnsi="Times New Roman" w:cs="Times New Roman"/>
+          <w:b w:val="0"/>
+          <w:i w:val="0"/>
+          <w:sz w:val="24"/>
+        </w:rPr>
+        <w:t xml:space="preserve"> (líneas 4-19):</w:t>
+      </w:r>
+    </w:p>
+    <w:p>
+      <w:pPr>
+        <w:spacing w:after="0" w:before="0"/>
+      </w:pPr>
+      <w:r>
+        <w:rPr>
+          <w:rFonts w:ascii="Consolas" w:hAnsi="Consolas" w:cs="Consolas"/>
+          <w:b w:val="0"/>
+          <w:i w:val="0"/>
+          <w:sz w:val="18"/>
+        </w:rPr>
+        <w:t>services:</w:t>
+      </w:r>
+    </w:p>
+    <w:p>
+      <w:pPr>
+        <w:spacing w:after="0" w:before="0"/>
+      </w:pPr>
+      <w:r>
+        <w:rPr>
+          <w:rFonts w:ascii="Consolas" w:hAnsi="Consolas" w:cs="Consolas"/>
+          <w:b w:val="0"/>
+          <w:i w:val="0"/>
+          <w:sz w:val="18"/>
+        </w:rPr>
+        <w:t xml:space="preserve">  mongodb:</w:t>
+      </w:r>
+    </w:p>
+    <w:p>
+      <w:pPr>
+        <w:spacing w:after="0" w:before="0"/>
+      </w:pPr>
+      <w:r>
+        <w:rPr>
+          <w:rFonts w:ascii="Consolas" w:hAnsi="Consolas" w:cs="Consolas"/>
+          <w:b w:val="0"/>
+          <w:i w:val="0"/>
+          <w:sz w:val="18"/>
+        </w:rPr>
+        <w:t xml:space="preserve">    image: mongo:6.0</w:t>
+      </w:r>
+    </w:p>
+    <w:p>
+      <w:pPr>
+        <w:spacing w:after="0" w:before="0"/>
+      </w:pPr>
+      <w:r>
+        <w:rPr>
+          <w:rFonts w:ascii="Consolas" w:hAnsi="Consolas" w:cs="Consolas"/>
+          <w:b w:val="0"/>
+          <w:i w:val="0"/>
+          <w:sz w:val="18"/>
+        </w:rPr>
+        <w:t xml:space="preserve">    container_name: respicare-mongodb</w:t>
+      </w:r>
+    </w:p>
+    <w:p>
+      <w:pPr>
+        <w:spacing w:after="0" w:before="0"/>
+      </w:pPr>
+      <w:r>
+        <w:rPr>
+          <w:rFonts w:ascii="Consolas" w:hAnsi="Consolas" w:cs="Consolas"/>
+          <w:b w:val="0"/>
+          <w:i w:val="0"/>
+          <w:sz w:val="18"/>
+        </w:rPr>
+        <w:t xml:space="preserve">    restart: unless-stopped</w:t>
+      </w:r>
+    </w:p>
+    <w:p>
+      <w:pPr>
+        <w:spacing w:after="0" w:before="0"/>
+      </w:pPr>
+      <w:r>
+        <w:rPr>
+          <w:rFonts w:ascii="Consolas" w:hAnsi="Consolas" w:cs="Consolas"/>
+          <w:b w:val="0"/>
+          <w:i w:val="0"/>
+          <w:sz w:val="18"/>
+        </w:rPr>
+        <w:t xml:space="preserve">    ports:</w:t>
+      </w:r>
+    </w:p>
+    <w:p>
+      <w:pPr>
+        <w:spacing w:after="0" w:before="0"/>
+      </w:pPr>
+      <w:r>
+        <w:rPr>
+          <w:rFonts w:ascii="Consolas" w:hAnsi="Consolas" w:cs="Consolas"/>
+          <w:b w:val="0"/>
+          <w:i w:val="0"/>
+          <w:sz w:val="18"/>
+        </w:rPr>
+        <w:t xml:space="preserve">      - "127.0.0.1:27017:27017"</w:t>
+      </w:r>
+    </w:p>
+    <w:p>
+      <w:pPr>
+        <w:spacing w:after="0" w:before="0"/>
+      </w:pPr>
+      <w:r>
+        <w:rPr>
+          <w:rFonts w:ascii="Consolas" w:hAnsi="Consolas" w:cs="Consolas"/>
+          <w:b w:val="0"/>
+          <w:i w:val="0"/>
+          <w:sz w:val="18"/>
+        </w:rPr>
+        <w:t xml:space="preserve">    environment:</w:t>
+      </w:r>
+    </w:p>
+    <w:p>
+      <w:pPr>
+        <w:spacing w:after="0" w:before="0"/>
+      </w:pPr>
+      <w:r>
+        <w:rPr>
+          <w:rFonts w:ascii="Consolas" w:hAnsi="Consolas" w:cs="Consolas"/>
+          <w:b w:val="0"/>
+          <w:i w:val="0"/>
+          <w:sz w:val="18"/>
+        </w:rPr>
+        <w:t xml:space="preserve">      MONGO_INITDB_ROOT_USERNAME: ${MONGO_USERNAME:-admin}</w:t>
+      </w:r>
+    </w:p>
+    <w:p>
+      <w:pPr>
+        <w:spacing w:after="0" w:before="0"/>
+      </w:pPr>
+      <w:r>
+        <w:rPr>
+          <w:rFonts w:ascii="Consolas" w:hAnsi="Consolas" w:cs="Consolas"/>
+          <w:b w:val="0"/>
+          <w:i w:val="0"/>
+          <w:sz w:val="18"/>
+        </w:rPr>
+        <w:t xml:space="preserve">      MONGO_INITDB_ROOT_PASSWORD: ${MONGO_PASSWORD:-password123}</w:t>
+      </w:r>
+    </w:p>
+    <w:p>
+      <w:pPr>
+        <w:spacing w:after="0" w:before="0"/>
+      </w:pPr>
+      <w:r>
+        <w:rPr>
+          <w:rFonts w:ascii="Consolas" w:hAnsi="Consolas" w:cs="Consolas"/>
+          <w:b w:val="0"/>
+          <w:i w:val="0"/>
+          <w:sz w:val="18"/>
+        </w:rPr>
+        <w:t xml:space="preserve">      MONGO_INITDB_DATABASE: ${MONGO_DB:-respicare}</w:t>
+      </w:r>
+    </w:p>
+    <w:p>
+      <w:pPr>
+        <w:spacing w:after="0" w:before="0"/>
+      </w:pPr>
+      <w:r>
+        <w:rPr>
+          <w:rFonts w:ascii="Consolas" w:hAnsi="Consolas" w:cs="Consolas"/>
+          <w:b w:val="0"/>
+          <w:i w:val="0"/>
+          <w:sz w:val="18"/>
+        </w:rPr>
+        <w:t xml:space="preserve">    volumes:</w:t>
+      </w:r>
+    </w:p>
+    <w:p>
+      <w:pPr>
+        <w:spacing w:after="0" w:before="0"/>
+      </w:pPr>
+      <w:r>
+        <w:rPr>
+          <w:rFonts w:ascii="Consolas" w:hAnsi="Consolas" w:cs="Consolas"/>
+          <w:b w:val="0"/>
+          <w:i w:val="0"/>
+          <w:sz w:val="18"/>
+        </w:rPr>
+        <w:t xml:space="preserve">      - mongodb_data:/data/db</w:t>
+      </w:r>
+    </w:p>
+    <w:p>
+      <w:pPr>
+        <w:spacing w:after="0" w:before="0"/>
+      </w:pPr>
+      <w:r>
+        <w:rPr>
+          <w:rFonts w:ascii="Consolas" w:hAnsi="Consolas" w:cs="Consolas"/>
+          <w:b w:val="0"/>
+          <w:i w:val="0"/>
+          <w:sz w:val="18"/>
+        </w:rPr>
+        <w:t xml:space="preserve">      - ./mongodb/init:/docker-entrypoint-initdb.d:ro</w:t>
+      </w:r>
+    </w:p>
+    <w:p>
+      <w:pPr>
+        <w:spacing w:after="0" w:before="0"/>
+      </w:pPr>
+      <w:r>
+        <w:rPr>
+          <w:rFonts w:ascii="Consolas" w:hAnsi="Consolas" w:cs="Consolas"/>
+          <w:b w:val="0"/>
+          <w:i w:val="0"/>
+          <w:sz w:val="18"/>
+        </w:rPr>
+        <w:t xml:space="preserve">    networks:</w:t>
+      </w:r>
+    </w:p>
+    <w:p>
+      <w:pPr>
+        <w:spacing w:after="0" w:before="0"/>
+      </w:pPr>
+      <w:r>
+        <w:rPr>
+          <w:rFonts w:ascii="Consolas" w:hAnsi="Consolas" w:cs="Consolas"/>
+          <w:b w:val="0"/>
+          <w:i w:val="0"/>
+          <w:sz w:val="18"/>
+        </w:rPr>
+        <w:t xml:space="preserve">      - respicare-network</w:t>
+      </w:r>
+    </w:p>
+    <w:p/>
+    <w:p>
+      <w:pPr>
+        <w:jc w:val="both"/>
+      </w:pPr>
+      <w:r>
+        <w:rPr>
+          <w:rFonts w:ascii="Times New Roman" w:hAnsi="Times New Roman" w:cs="Times New Roman"/>
+          <w:b w:val="0"/>
+          <w:i/>
+          <w:sz w:val="24"/>
+        </w:rPr>
+        <w:t>Entregable: Configuración de CI/CD (GitHub Actions)</w:t>
+      </w:r>
+    </w:p>
+    <w:p>
+      <w:pPr>
+        <w:jc w:val="both"/>
+      </w:pPr>
+      <w:r>
+        <w:rPr>
+          <w:rFonts w:ascii="Consolas" w:hAnsi="Consolas" w:cs="Consolas"/>
+          <w:b w:val="0"/>
+          <w:i w:val="0"/>
+          <w:sz w:val="18"/>
+        </w:rPr>
+        <w:t>.github/workflows/ci-cd-complete.yml</w:t>
+      </w:r>
+      <w:r>
+        <w:rPr>
+          <w:rFonts w:ascii="Times New Roman" w:hAnsi="Times New Roman" w:cs="Times New Roman"/>
+          <w:b w:val="0"/>
+          <w:i w:val="0"/>
+          <w:sz w:val="24"/>
+        </w:rPr>
+        <w:t xml:space="preserve"> (líneas 1-17):</w:t>
+      </w:r>
+    </w:p>
+    <w:p>
+      <w:pPr>
+        <w:spacing w:after="0" w:before="0"/>
+      </w:pPr>
+      <w:r>
+        <w:rPr>
+          <w:rFonts w:ascii="Consolas" w:hAnsi="Consolas" w:cs="Consolas"/>
+          <w:b w:val="0"/>
+          <w:i w:val="0"/>
+          <w:sz w:val="18"/>
+        </w:rPr>
+        <w:t>name: Complete CI/CD Pipeline</w:t>
+      </w:r>
+    </w:p>
+    <w:p>
+      <w:pPr>
+        <w:spacing w:after="0" w:before="0"/>
+      </w:pPr>
+      <w:r>
+        <w:rPr>
+          <w:rFonts w:ascii="Consolas" w:hAnsi="Consolas" w:cs="Consolas"/>
+          <w:b w:val="0"/>
+          <w:i w:val="0"/>
+          <w:sz w:val="18"/>
+        </w:rPr>
+        <w:t xml:space="preserve"> </w:t>
+      </w:r>
+    </w:p>
+    <w:p>
+      <w:pPr>
+        <w:spacing w:after="0" w:before="0"/>
+      </w:pPr>
+      <w:r>
+        <w:rPr>
+          <w:rFonts w:ascii="Consolas" w:hAnsi="Consolas" w:cs="Consolas"/>
+          <w:b w:val="0"/>
+          <w:i w:val="0"/>
+          <w:sz w:val="18"/>
+        </w:rPr>
+        <w:t>on:</w:t>
+      </w:r>
+    </w:p>
+    <w:p>
+      <w:pPr>
+        <w:spacing w:after="0" w:before="0"/>
+      </w:pPr>
+      <w:r>
+        <w:rPr>
+          <w:rFonts w:ascii="Consolas" w:hAnsi="Consolas" w:cs="Consolas"/>
+          <w:b w:val="0"/>
+          <w:i w:val="0"/>
+          <w:sz w:val="18"/>
+        </w:rPr>
+        <w:t xml:space="preserve">  push:</w:t>
+      </w:r>
+    </w:p>
+    <w:p>
+      <w:pPr>
+        <w:spacing w:after="0" w:before="0"/>
+      </w:pPr>
+      <w:r>
+        <w:rPr>
+          <w:rFonts w:ascii="Consolas" w:hAnsi="Consolas" w:cs="Consolas"/>
+          <w:b w:val="0"/>
+          <w:i w:val="0"/>
+          <w:sz w:val="18"/>
+        </w:rPr>
+        <w:t xml:space="preserve">    branches: [ main, develop ]</w:t>
+      </w:r>
+    </w:p>
+    <w:p>
+      <w:pPr>
+        <w:spacing w:after="0" w:before="0"/>
+      </w:pPr>
+      <w:r>
+        <w:rPr>
+          <w:rFonts w:ascii="Consolas" w:hAnsi="Consolas" w:cs="Consolas"/>
+          <w:b w:val="0"/>
+          <w:i w:val="0"/>
+          <w:sz w:val="18"/>
+        </w:rPr>
+        <w:t xml:space="preserve">  pull_request:</w:t>
+      </w:r>
+    </w:p>
+    <w:p>
+      <w:pPr>
+        <w:spacing w:after="0" w:before="0"/>
+      </w:pPr>
+      <w:r>
+        <w:rPr>
+          <w:rFonts w:ascii="Consolas" w:hAnsi="Consolas" w:cs="Consolas"/>
+          <w:b w:val="0"/>
+          <w:i w:val="0"/>
+          <w:sz w:val="18"/>
+        </w:rPr>
+        <w:t xml:space="preserve">    branches: [ main, develop ]</w:t>
+      </w:r>
+    </w:p>
+    <w:p>
+      <w:pPr>
+        <w:spacing w:after="0" w:before="0"/>
+      </w:pPr>
+      <w:r>
+        <w:rPr>
+          <w:rFonts w:ascii="Consolas" w:hAnsi="Consolas" w:cs="Consolas"/>
+          <w:b w:val="0"/>
+          <w:i w:val="0"/>
+          <w:sz w:val="18"/>
+        </w:rPr>
+        <w:t xml:space="preserve"> </w:t>
+      </w:r>
+    </w:p>
+    <w:p>
+      <w:pPr>
+        <w:spacing w:after="0" w:before="0"/>
+      </w:pPr>
+      <w:r>
+        <w:rPr>
+          <w:rFonts w:ascii="Consolas" w:hAnsi="Consolas" w:cs="Consolas"/>
+          <w:b w:val="0"/>
+          <w:i w:val="0"/>
+          <w:sz w:val="18"/>
+        </w:rPr>
+        <w:t>env:</w:t>
+      </w:r>
+    </w:p>
+    <w:p>
+      <w:pPr>
+        <w:spacing w:after="0" w:before="0"/>
+      </w:pPr>
+      <w:r>
+        <w:rPr>
+          <w:rFonts w:ascii="Consolas" w:hAnsi="Consolas" w:cs="Consolas"/>
+          <w:b w:val="0"/>
+          <w:i w:val="0"/>
+          <w:sz w:val="18"/>
+        </w:rPr>
+        <w:t xml:space="preserve">  NODE_VERSION: '18'</w:t>
+      </w:r>
+    </w:p>
+    <w:p>
+      <w:pPr>
+        <w:spacing w:after="0" w:before="0"/>
+      </w:pPr>
+      <w:r>
+        <w:rPr>
+          <w:rFonts w:ascii="Consolas" w:hAnsi="Consolas" w:cs="Consolas"/>
+          <w:b w:val="0"/>
+          <w:i w:val="0"/>
+          <w:sz w:val="18"/>
+        </w:rPr>
+        <w:t xml:space="preserve">  PYTHON_VERSION: '3.10'</w:t>
+      </w:r>
+    </w:p>
+    <w:p>
+      <w:pPr>
+        <w:spacing w:after="0" w:before="0"/>
+      </w:pPr>
+      <w:r>
+        <w:rPr>
+          <w:rFonts w:ascii="Consolas" w:hAnsi="Consolas" w:cs="Consolas"/>
+          <w:b w:val="0"/>
+          <w:i w:val="0"/>
+          <w:sz w:val="18"/>
+        </w:rPr>
+        <w:t xml:space="preserve"> </w:t>
+      </w:r>
+    </w:p>
+    <w:p>
+      <w:pPr>
+        <w:spacing w:after="0" w:before="0"/>
+      </w:pPr>
+      <w:r>
+        <w:rPr>
+          <w:rFonts w:ascii="Consolas" w:hAnsi="Consolas" w:cs="Consolas"/>
+          <w:b w:val="0"/>
+          <w:i w:val="0"/>
+          <w:sz w:val="18"/>
+        </w:rPr>
+        <w:t>permissions:</w:t>
+      </w:r>
+    </w:p>
+    <w:p>
+      <w:pPr>
+        <w:spacing w:after="0" w:before="0"/>
+      </w:pPr>
+      <w:r>
+        <w:rPr>
+          <w:rFonts w:ascii="Consolas" w:hAnsi="Consolas" w:cs="Consolas"/>
+          <w:b w:val="0"/>
+          <w:i w:val="0"/>
+          <w:sz w:val="18"/>
+        </w:rPr>
+        <w:t xml:space="preserve">  contents: read</w:t>
+      </w:r>
+    </w:p>
+    <w:p>
+      <w:pPr>
+        <w:spacing w:after="0" w:before="0"/>
+      </w:pPr>
+      <w:r>
+        <w:rPr>
+          <w:rFonts w:ascii="Consolas" w:hAnsi="Consolas" w:cs="Consolas"/>
+          <w:b w:val="0"/>
+          <w:i w:val="0"/>
+          <w:sz w:val="18"/>
+        </w:rPr>
+        <w:t xml:space="preserve"> </w:t>
+      </w:r>
+    </w:p>
+    <w:p>
+      <w:pPr>
+        <w:spacing w:after="0" w:before="0"/>
+      </w:pPr>
+      <w:r>
+        <w:rPr>
+          <w:rFonts w:ascii="Consolas" w:hAnsi="Consolas" w:cs="Consolas"/>
+          <w:b w:val="0"/>
+          <w:i w:val="0"/>
+          <w:sz w:val="18"/>
+        </w:rPr>
+        <w:t>jobs:</w:t>
+      </w:r>
+    </w:p>
+    <w:p/>
+    <w:p>
+      <w:pPr>
         <w:spacing w:before="240" w:after="120"/>
       </w:pPr>
       <w:r>

</xml_diff>